<commit_message>
Standardize all table formations: booktabs styling, clean headers, landscape for wide tables, no clipping
</commit_message>
<xml_diff>
--- a/results/Table_S4_Multicollinearity_VIF.docx
+++ b/results/Table_S4_Multicollinearity_VIF.docx
@@ -24,41 +24,61 @@
         <w:jc w:val="center"/>
         <w:tblLayout w:type="fixed"/>
         <w:tblLook w:firstColumn="1" w:firstRow="1" w:lastColumn="0" w:lastRow="0" w:noHBand="0" w:noVBand="1" w:val="04A0"/>
+        <w:tblInd w:w="0"/>
+        <w:tblBorders>
+          <w:top w:val="single" w:sz="12" w:space="0" w:color="000000"/>
+          <w:bottom w:val="single" w:sz="12" w:space="0" w:color="000000"/>
+          <w:left w:val="none"/>
+          <w:right w:val="none"/>
+          <w:insideH w:val="none"/>
+          <w:insideV w:val="none"/>
+        </w:tblBorders>
+        <w:tblCellMar>
+          <w:top w:w="120" w:type="dxa"/>
+          <w:bottom w:w="120" w:type="dxa"/>
+          <w:left w:w="150" w:type="dxa"/>
+          <w:right w:w="150" w:type="dxa"/>
+        </w:tblCellMar>
       </w:tblPr>
       <w:tblGrid>
-        <w:gridCol w:w="2340"/>
-        <w:gridCol w:w="2340"/>
-        <w:gridCol w:w="2340"/>
-        <w:gridCol w:w="2340"/>
+        <w:gridCol w:w="3600"/>
+        <w:gridCol w:w="2015"/>
+        <w:gridCol w:w="2015"/>
+        <w:gridCol w:w="2160"/>
       </w:tblGrid>
       <w:tr>
+        <w:trPr>
+          <w:cantSplit/>
+          <w:tblHeader/>
+        </w:trPr>
         <w:tc>
           <w:tcPr>
-            <w:tcW w:type="dxa" w:w="4320"/>
+            <w:tcW w:type="dxa" w:w="3600"/>
             <w:tcMar>
               <w:top w:w="120" w:type="dxa"/>
               <w:bottom w:w="120" w:type="dxa"/>
               <w:left w:w="100" w:type="dxa"/>
               <w:right w:w="100" w:type="dxa"/>
             </w:tcMar>
+            <w:shd w:fill="FFFFFF" w:val="clear"/>
             <w:tcBorders>
-              <w:top w:val="single" w:sz="8" w:color="auto"/>
-              <w:bottom w:val="single" w:sz="6" w:color="auto"/>
+              <w:bottom w:val="single" w:sz="6" w:space="0" w:color="000000"/>
+              <w:top w:val="none"/>
               <w:left w:val="none"/>
               <w:right w:val="none"/>
             </w:tcBorders>
           </w:tcPr>
           <w:p>
             <w:pPr>
-              <w:spacing w:after="40" w:line="240" w:lineRule="auto"/>
+              <w:spacing w:before="0" w:after="0" w:line="276" w:lineRule="auto"/>
               <w:jc w:val="left"/>
             </w:pPr>
             <w:r>
               <w:rPr>
-                <w:rFonts w:ascii="Times New Roman" w:hAnsi="Times New Roman"/>
+                <w:rFonts w:ascii="Cambria" w:hAnsi="Cambria"/>
                 <w:b/>
                 <w:color w:val="000000"/>
-                <w:sz w:val="19"/>
+                <w:sz w:val="20"/>
               </w:rPr>
               <w:t>Variable</w:t>
             </w:r>
@@ -66,31 +86,32 @@
         </w:tc>
         <w:tc>
           <w:tcPr>
-            <w:tcW w:type="dxa" w:w="1728"/>
+            <w:tcW w:type="dxa" w:w="2015"/>
             <w:tcMar>
               <w:top w:w="120" w:type="dxa"/>
               <w:bottom w:w="120" w:type="dxa"/>
               <w:left w:w="100" w:type="dxa"/>
               <w:right w:w="100" w:type="dxa"/>
             </w:tcMar>
+            <w:shd w:fill="FFFFFF" w:val="clear"/>
             <w:tcBorders>
-              <w:top w:val="single" w:sz="8" w:color="auto"/>
-              <w:bottom w:val="single" w:sz="6" w:color="auto"/>
+              <w:bottom w:val="single" w:sz="6" w:space="0" w:color="000000"/>
+              <w:top w:val="none"/>
               <w:left w:val="none"/>
               <w:right w:val="none"/>
             </w:tcBorders>
           </w:tcPr>
           <w:p>
             <w:pPr>
-              <w:spacing w:after="40" w:line="240" w:lineRule="auto"/>
-              <w:jc w:val="left"/>
+              <w:spacing w:before="0" w:after="0" w:line="276" w:lineRule="auto"/>
+              <w:jc w:val="center"/>
             </w:pPr>
             <w:r>
               <w:rPr>
-                <w:rFonts w:ascii="Times New Roman" w:hAnsi="Times New Roman"/>
+                <w:rFonts w:ascii="Cambria" w:hAnsi="Cambria"/>
                 <w:b/>
                 <w:color w:val="000000"/>
-                <w:sz w:val="19"/>
+                <w:sz w:val="20"/>
               </w:rPr>
               <w:t>GVIF</w:t>
             </w:r>
@@ -98,31 +119,32 @@
         </w:tc>
         <w:tc>
           <w:tcPr>
-            <w:tcW w:type="dxa" w:w="1152"/>
+            <w:tcW w:type="dxa" w:w="2015"/>
             <w:tcMar>
               <w:top w:w="120" w:type="dxa"/>
               <w:bottom w:w="120" w:type="dxa"/>
               <w:left w:w="100" w:type="dxa"/>
               <w:right w:w="100" w:type="dxa"/>
             </w:tcMar>
+            <w:shd w:fill="FFFFFF" w:val="clear"/>
             <w:tcBorders>
-              <w:top w:val="single" w:sz="8" w:color="auto"/>
-              <w:bottom w:val="single" w:sz="6" w:color="auto"/>
+              <w:bottom w:val="single" w:sz="6" w:space="0" w:color="000000"/>
+              <w:top w:val="none"/>
               <w:left w:val="none"/>
               <w:right w:val="none"/>
             </w:tcBorders>
           </w:tcPr>
           <w:p>
             <w:pPr>
-              <w:spacing w:after="40" w:line="240" w:lineRule="auto"/>
+              <w:spacing w:before="0" w:after="0" w:line="276" w:lineRule="auto"/>
               <w:jc w:val="center"/>
             </w:pPr>
             <w:r>
               <w:rPr>
-                <w:rFonts w:ascii="Times New Roman" w:hAnsi="Times New Roman"/>
+                <w:rFonts w:ascii="Cambria" w:hAnsi="Cambria"/>
                 <w:b/>
                 <w:color w:val="000000"/>
-                <w:sz w:val="19"/>
+                <w:sz w:val="20"/>
               </w:rPr>
               <w:t>df</w:t>
             </w:r>
@@ -137,34 +159,38 @@
               <w:left w:w="100" w:type="dxa"/>
               <w:right w:w="100" w:type="dxa"/>
             </w:tcMar>
+            <w:shd w:fill="FFFFFF" w:val="clear"/>
             <w:tcBorders>
-              <w:top w:val="single" w:sz="8" w:color="auto"/>
-              <w:bottom w:val="single" w:sz="6" w:color="auto"/>
+              <w:bottom w:val="single" w:sz="6" w:space="0" w:color="000000"/>
+              <w:top w:val="none"/>
               <w:left w:val="none"/>
               <w:right w:val="none"/>
             </w:tcBorders>
           </w:tcPr>
           <w:p>
             <w:pPr>
-              <w:spacing w:after="40" w:line="240" w:lineRule="auto"/>
+              <w:spacing w:before="0" w:after="0" w:line="276" w:lineRule="auto"/>
               <w:jc w:val="center"/>
             </w:pPr>
             <w:r>
               <w:rPr>
-                <w:rFonts w:ascii="Times New Roman" w:hAnsi="Times New Roman"/>
+                <w:rFonts w:ascii="Cambria" w:hAnsi="Cambria"/>
                 <w:b/>
                 <w:color w:val="000000"/>
-                <w:sz w:val="19"/>
+                <w:sz w:val="20"/>
               </w:rPr>
-              <w:t>GVIF_Adjusted</w:t>
+              <w:t>Adjusted GVIF</w:t>
             </w:r>
           </w:p>
         </w:tc>
       </w:tr>
       <w:tr>
+        <w:trPr>
+          <w:cantSplit/>
+        </w:trPr>
         <w:tc>
           <w:tcPr>
-            <w:tcW w:type="dxa" w:w="4320"/>
+            <w:tcW w:type="dxa" w:w="3600"/>
             <w:tcMar>
               <w:top w:w="80" w:type="dxa"/>
               <w:bottom w:w="80" w:type="dxa"/>
@@ -177,26 +203,26 @@
               <w:left w:val="none"/>
               <w:right w:val="none"/>
             </w:tcBorders>
+            <w:shd w:fill="FFFFFF" w:val="clear"/>
           </w:tcPr>
           <w:p>
             <w:pPr>
-              <w:spacing w:after="40" w:line="240" w:lineRule="auto"/>
+              <w:spacing w:before="0" w:after="0" w:line="276" w:lineRule="auto"/>
               <w:jc w:val="left"/>
             </w:pPr>
             <w:r>
               <w:rPr>
-                <w:rFonts w:ascii="Times New Roman" w:hAnsi="Times New Roman"/>
-                <w:b/>
+                <w:rFonts w:ascii="Cambria" w:hAnsi="Cambria"/>
                 <w:color w:val="000000"/>
                 <w:sz w:val="19"/>
               </w:rPr>
-              <w:t>Child_Age</w:t>
+              <w:t>Child age</w:t>
             </w:r>
           </w:p>
         </w:tc>
         <w:tc>
           <w:tcPr>
-            <w:tcW w:type="dxa" w:w="1728"/>
+            <w:tcW w:type="dxa" w:w="2015"/>
             <w:tcMar>
               <w:top w:w="80" w:type="dxa"/>
               <w:bottom w:w="80" w:type="dxa"/>
@@ -209,15 +235,16 @@
               <w:left w:val="none"/>
               <w:right w:val="none"/>
             </w:tcBorders>
+            <w:shd w:fill="FFFFFF" w:val="clear"/>
           </w:tcPr>
           <w:p>
             <w:pPr>
-              <w:spacing w:after="40" w:line="240" w:lineRule="auto"/>
-              <w:jc w:val="left"/>
+              <w:spacing w:after="0" w:line="276" w:lineRule="auto" w:before="0"/>
+              <w:jc w:val="center"/>
             </w:pPr>
             <w:r>
               <w:rPr>
-                <w:rFonts w:ascii="Times New Roman" w:hAnsi="Times New Roman"/>
+                <w:rFonts w:ascii="Cambria" w:hAnsi="Cambria"/>
                 <w:color w:val="000000"/>
                 <w:sz w:val="19"/>
               </w:rPr>
@@ -227,7 +254,7 @@
         </w:tc>
         <w:tc>
           <w:tcPr>
-            <w:tcW w:type="dxa" w:w="1152"/>
+            <w:tcW w:type="dxa" w:w="2015"/>
             <w:tcMar>
               <w:top w:w="80" w:type="dxa"/>
               <w:bottom w:w="80" w:type="dxa"/>
@@ -240,15 +267,16 @@
               <w:left w:val="none"/>
               <w:right w:val="none"/>
             </w:tcBorders>
+            <w:shd w:fill="FFFFFF" w:val="clear"/>
           </w:tcPr>
           <w:p>
             <w:pPr>
-              <w:spacing w:after="40" w:line="240" w:lineRule="auto"/>
+              <w:spacing w:after="0" w:line="276" w:lineRule="auto" w:before="0"/>
               <w:jc w:val="center"/>
             </w:pPr>
             <w:r>
               <w:rPr>
-                <w:rFonts w:ascii="Times New Roman" w:hAnsi="Times New Roman"/>
+                <w:rFonts w:ascii="Cambria" w:hAnsi="Cambria"/>
                 <w:color w:val="000000"/>
                 <w:sz w:val="19"/>
               </w:rPr>
@@ -271,15 +299,16 @@
               <w:left w:val="none"/>
               <w:right w:val="none"/>
             </w:tcBorders>
+            <w:shd w:fill="FFFFFF" w:val="clear"/>
           </w:tcPr>
           <w:p>
             <w:pPr>
-              <w:spacing w:after="40" w:line="240" w:lineRule="auto"/>
+              <w:spacing w:after="0" w:line="276" w:lineRule="auto" w:before="0"/>
               <w:jc w:val="center"/>
             </w:pPr>
             <w:r>
               <w:rPr>
-                <w:rFonts w:ascii="Times New Roman" w:hAnsi="Times New Roman"/>
+                <w:rFonts w:ascii="Cambria" w:hAnsi="Cambria"/>
                 <w:color w:val="000000"/>
                 <w:sz w:val="19"/>
               </w:rPr>
@@ -289,9 +318,12 @@
         </w:tc>
       </w:tr>
       <w:tr>
+        <w:trPr>
+          <w:cantSplit/>
+        </w:trPr>
         <w:tc>
           <w:tcPr>
-            <w:tcW w:type="dxa" w:w="4320"/>
+            <w:tcW w:type="dxa" w:w="3600"/>
             <w:tcMar>
               <w:top w:w="80" w:type="dxa"/>
               <w:bottom w:w="80" w:type="dxa"/>
@@ -304,26 +336,26 @@
               <w:left w:val="none"/>
               <w:right w:val="none"/>
             </w:tcBorders>
+            <w:shd w:fill="FFFFFF" w:val="clear"/>
           </w:tcPr>
           <w:p>
             <w:pPr>
-              <w:spacing w:after="40" w:line="240" w:lineRule="auto"/>
+              <w:spacing w:before="0" w:after="0" w:line="276" w:lineRule="auto"/>
               <w:jc w:val="left"/>
             </w:pPr>
             <w:r>
               <w:rPr>
-                <w:rFonts w:ascii="Times New Roman" w:hAnsi="Times New Roman"/>
-                <w:b/>
+                <w:rFonts w:ascii="Cambria" w:hAnsi="Cambria"/>
                 <w:color w:val="000000"/>
                 <w:sz w:val="19"/>
               </w:rPr>
-              <w:t>Birth_Order</w:t>
+              <w:t>Birth order</w:t>
             </w:r>
           </w:p>
         </w:tc>
         <w:tc>
           <w:tcPr>
-            <w:tcW w:type="dxa" w:w="1728"/>
+            <w:tcW w:type="dxa" w:w="2015"/>
             <w:tcMar>
               <w:top w:w="80" w:type="dxa"/>
               <w:bottom w:w="80" w:type="dxa"/>
@@ -336,15 +368,16 @@
               <w:left w:val="none"/>
               <w:right w:val="none"/>
             </w:tcBorders>
+            <w:shd w:fill="FFFFFF" w:val="clear"/>
           </w:tcPr>
           <w:p>
             <w:pPr>
-              <w:spacing w:after="40" w:line="240" w:lineRule="auto"/>
-              <w:jc w:val="left"/>
+              <w:spacing w:after="0" w:line="276" w:lineRule="auto" w:before="0"/>
+              <w:jc w:val="center"/>
             </w:pPr>
             <w:r>
               <w:rPr>
-                <w:rFonts w:ascii="Times New Roman" w:hAnsi="Times New Roman"/>
+                <w:rFonts w:ascii="Cambria" w:hAnsi="Cambria"/>
                 <w:color w:val="000000"/>
                 <w:sz w:val="19"/>
               </w:rPr>
@@ -354,7 +387,7 @@
         </w:tc>
         <w:tc>
           <w:tcPr>
-            <w:tcW w:type="dxa" w:w="1152"/>
+            <w:tcW w:type="dxa" w:w="2015"/>
             <w:tcMar>
               <w:top w:w="80" w:type="dxa"/>
               <w:bottom w:w="80" w:type="dxa"/>
@@ -367,15 +400,16 @@
               <w:left w:val="none"/>
               <w:right w:val="none"/>
             </w:tcBorders>
+            <w:shd w:fill="FFFFFF" w:val="clear"/>
           </w:tcPr>
           <w:p>
             <w:pPr>
-              <w:spacing w:after="40" w:line="240" w:lineRule="auto"/>
+              <w:spacing w:after="0" w:line="276" w:lineRule="auto" w:before="0"/>
               <w:jc w:val="center"/>
             </w:pPr>
             <w:r>
               <w:rPr>
-                <w:rFonts w:ascii="Times New Roman" w:hAnsi="Times New Roman"/>
+                <w:rFonts w:ascii="Cambria" w:hAnsi="Cambria"/>
                 <w:color w:val="000000"/>
                 <w:sz w:val="19"/>
               </w:rPr>
@@ -398,15 +432,16 @@
               <w:left w:val="none"/>
               <w:right w:val="none"/>
             </w:tcBorders>
+            <w:shd w:fill="FFFFFF" w:val="clear"/>
           </w:tcPr>
           <w:p>
             <w:pPr>
-              <w:spacing w:after="40" w:line="240" w:lineRule="auto"/>
+              <w:spacing w:after="0" w:line="276" w:lineRule="auto" w:before="0"/>
               <w:jc w:val="center"/>
             </w:pPr>
             <w:r>
               <w:rPr>
-                <w:rFonts w:ascii="Times New Roman" w:hAnsi="Times New Roman"/>
+                <w:rFonts w:ascii="Cambria" w:hAnsi="Cambria"/>
                 <w:color w:val="000000"/>
                 <w:sz w:val="19"/>
               </w:rPr>
@@ -416,9 +451,12 @@
         </w:tc>
       </w:tr>
       <w:tr>
+        <w:trPr>
+          <w:cantSplit/>
+        </w:trPr>
         <w:tc>
           <w:tcPr>
-            <w:tcW w:type="dxa" w:w="4320"/>
+            <w:tcW w:type="dxa" w:w="3600"/>
             <w:tcMar>
               <w:top w:w="80" w:type="dxa"/>
               <w:bottom w:w="80" w:type="dxa"/>
@@ -431,26 +469,26 @@
               <w:left w:val="none"/>
               <w:right w:val="none"/>
             </w:tcBorders>
+            <w:shd w:fill="FFFFFF" w:val="clear"/>
           </w:tcPr>
           <w:p>
             <w:pPr>
-              <w:spacing w:after="40" w:line="240" w:lineRule="auto"/>
+              <w:spacing w:before="0" w:after="0" w:line="276" w:lineRule="auto"/>
               <w:jc w:val="left"/>
             </w:pPr>
             <w:r>
               <w:rPr>
-                <w:rFonts w:ascii="Times New Roman" w:hAnsi="Times New Roman"/>
-                <w:b/>
+                <w:rFonts w:ascii="Cambria" w:hAnsi="Cambria"/>
                 <w:color w:val="000000"/>
                 <w:sz w:val="19"/>
               </w:rPr>
-              <w:t>Mother_Age</w:t>
+              <w:t>Mother's age</w:t>
             </w:r>
           </w:p>
         </w:tc>
         <w:tc>
           <w:tcPr>
-            <w:tcW w:type="dxa" w:w="1728"/>
+            <w:tcW w:type="dxa" w:w="2015"/>
             <w:tcMar>
               <w:top w:w="80" w:type="dxa"/>
               <w:bottom w:w="80" w:type="dxa"/>
@@ -463,15 +501,16 @@
               <w:left w:val="none"/>
               <w:right w:val="none"/>
             </w:tcBorders>
+            <w:shd w:fill="FFFFFF" w:val="clear"/>
           </w:tcPr>
           <w:p>
             <w:pPr>
-              <w:spacing w:after="40" w:line="240" w:lineRule="auto"/>
-              <w:jc w:val="left"/>
+              <w:spacing w:after="0" w:line="276" w:lineRule="auto" w:before="0"/>
+              <w:jc w:val="center"/>
             </w:pPr>
             <w:r>
               <w:rPr>
-                <w:rFonts w:ascii="Times New Roman" w:hAnsi="Times New Roman"/>
+                <w:rFonts w:ascii="Cambria" w:hAnsi="Cambria"/>
                 <w:color w:val="000000"/>
                 <w:sz w:val="19"/>
               </w:rPr>
@@ -481,7 +520,7 @@
         </w:tc>
         <w:tc>
           <w:tcPr>
-            <w:tcW w:type="dxa" w:w="1152"/>
+            <w:tcW w:type="dxa" w:w="2015"/>
             <w:tcMar>
               <w:top w:w="80" w:type="dxa"/>
               <w:bottom w:w="80" w:type="dxa"/>
@@ -494,15 +533,16 @@
               <w:left w:val="none"/>
               <w:right w:val="none"/>
             </w:tcBorders>
+            <w:shd w:fill="FFFFFF" w:val="clear"/>
           </w:tcPr>
           <w:p>
             <w:pPr>
-              <w:spacing w:after="40" w:line="240" w:lineRule="auto"/>
+              <w:spacing w:after="0" w:line="276" w:lineRule="auto" w:before="0"/>
               <w:jc w:val="center"/>
             </w:pPr>
             <w:r>
               <w:rPr>
-                <w:rFonts w:ascii="Times New Roman" w:hAnsi="Times New Roman"/>
+                <w:rFonts w:ascii="Cambria" w:hAnsi="Cambria"/>
                 <w:color w:val="000000"/>
                 <w:sz w:val="19"/>
               </w:rPr>
@@ -525,15 +565,16 @@
               <w:left w:val="none"/>
               <w:right w:val="none"/>
             </w:tcBorders>
+            <w:shd w:fill="FFFFFF" w:val="clear"/>
           </w:tcPr>
           <w:p>
             <w:pPr>
-              <w:spacing w:after="40" w:line="240" w:lineRule="auto"/>
+              <w:spacing w:after="0" w:line="276" w:lineRule="auto" w:before="0"/>
               <w:jc w:val="center"/>
             </w:pPr>
             <w:r>
               <w:rPr>
-                <w:rFonts w:ascii="Times New Roman" w:hAnsi="Times New Roman"/>
+                <w:rFonts w:ascii="Cambria" w:hAnsi="Cambria"/>
                 <w:color w:val="000000"/>
                 <w:sz w:val="19"/>
               </w:rPr>
@@ -543,9 +584,12 @@
         </w:tc>
       </w:tr>
       <w:tr>
+        <w:trPr>
+          <w:cantSplit/>
+        </w:trPr>
         <w:tc>
           <w:tcPr>
-            <w:tcW w:type="dxa" w:w="4320"/>
+            <w:tcW w:type="dxa" w:w="3600"/>
             <w:tcMar>
               <w:top w:w="80" w:type="dxa"/>
               <w:bottom w:w="80" w:type="dxa"/>
@@ -558,26 +602,26 @@
               <w:left w:val="none"/>
               <w:right w:val="none"/>
             </w:tcBorders>
+            <w:shd w:fill="FFFFFF" w:val="clear"/>
           </w:tcPr>
           <w:p>
             <w:pPr>
-              <w:spacing w:after="40" w:line="240" w:lineRule="auto"/>
+              <w:spacing w:before="0" w:after="0" w:line="276" w:lineRule="auto"/>
               <w:jc w:val="left"/>
             </w:pPr>
             <w:r>
               <w:rPr>
-                <w:rFonts w:ascii="Times New Roman" w:hAnsi="Times New Roman"/>
-                <w:b/>
+                <w:rFonts w:ascii="Cambria" w:hAnsi="Cambria"/>
                 <w:color w:val="000000"/>
                 <w:sz w:val="19"/>
               </w:rPr>
-              <w:t>Mother_Education</w:t>
+              <w:t>Mother's education level</w:t>
             </w:r>
           </w:p>
         </w:tc>
         <w:tc>
           <w:tcPr>
-            <w:tcW w:type="dxa" w:w="1728"/>
+            <w:tcW w:type="dxa" w:w="2015"/>
             <w:tcMar>
               <w:top w:w="80" w:type="dxa"/>
               <w:bottom w:w="80" w:type="dxa"/>
@@ -590,15 +634,16 @@
               <w:left w:val="none"/>
               <w:right w:val="none"/>
             </w:tcBorders>
+            <w:shd w:fill="FFFFFF" w:val="clear"/>
           </w:tcPr>
           <w:p>
             <w:pPr>
-              <w:spacing w:after="40" w:line="240" w:lineRule="auto"/>
-              <w:jc w:val="left"/>
+              <w:spacing w:after="0" w:line="276" w:lineRule="auto" w:before="0"/>
+              <w:jc w:val="center"/>
             </w:pPr>
             <w:r>
               <w:rPr>
-                <w:rFonts w:ascii="Times New Roman" w:hAnsi="Times New Roman"/>
+                <w:rFonts w:ascii="Cambria" w:hAnsi="Cambria"/>
                 <w:color w:val="000000"/>
                 <w:sz w:val="19"/>
               </w:rPr>
@@ -608,7 +653,7 @@
         </w:tc>
         <w:tc>
           <w:tcPr>
-            <w:tcW w:type="dxa" w:w="1152"/>
+            <w:tcW w:type="dxa" w:w="2015"/>
             <w:tcMar>
               <w:top w:w="80" w:type="dxa"/>
               <w:bottom w:w="80" w:type="dxa"/>
@@ -621,15 +666,16 @@
               <w:left w:val="none"/>
               <w:right w:val="none"/>
             </w:tcBorders>
+            <w:shd w:fill="FFFFFF" w:val="clear"/>
           </w:tcPr>
           <w:p>
             <w:pPr>
-              <w:spacing w:after="40" w:line="240" w:lineRule="auto"/>
+              <w:spacing w:after="0" w:line="276" w:lineRule="auto" w:before="0"/>
               <w:jc w:val="center"/>
             </w:pPr>
             <w:r>
               <w:rPr>
-                <w:rFonts w:ascii="Times New Roman" w:hAnsi="Times New Roman"/>
+                <w:rFonts w:ascii="Cambria" w:hAnsi="Cambria"/>
                 <w:color w:val="000000"/>
                 <w:sz w:val="19"/>
               </w:rPr>
@@ -652,15 +698,16 @@
               <w:left w:val="none"/>
               <w:right w:val="none"/>
             </w:tcBorders>
+            <w:shd w:fill="FFFFFF" w:val="clear"/>
           </w:tcPr>
           <w:p>
             <w:pPr>
-              <w:spacing w:after="40" w:line="240" w:lineRule="auto"/>
+              <w:spacing w:after="0" w:line="276" w:lineRule="auto" w:before="0"/>
               <w:jc w:val="center"/>
             </w:pPr>
             <w:r>
               <w:rPr>
-                <w:rFonts w:ascii="Times New Roman" w:hAnsi="Times New Roman"/>
+                <w:rFonts w:ascii="Cambria" w:hAnsi="Cambria"/>
                 <w:color w:val="000000"/>
                 <w:sz w:val="19"/>
               </w:rPr>
@@ -670,9 +717,12 @@
         </w:tc>
       </w:tr>
       <w:tr>
+        <w:trPr>
+          <w:cantSplit/>
+        </w:trPr>
         <w:tc>
           <w:tcPr>
-            <w:tcW w:type="dxa" w:w="4320"/>
+            <w:tcW w:type="dxa" w:w="3600"/>
             <w:tcMar>
               <w:top w:w="80" w:type="dxa"/>
               <w:bottom w:w="80" w:type="dxa"/>
@@ -685,26 +735,26 @@
               <w:left w:val="none"/>
               <w:right w:val="none"/>
             </w:tcBorders>
+            <w:shd w:fill="FFFFFF" w:val="clear"/>
           </w:tcPr>
           <w:p>
             <w:pPr>
-              <w:spacing w:after="40" w:line="240" w:lineRule="auto"/>
+              <w:spacing w:before="0" w:after="0" w:line="276" w:lineRule="auto"/>
               <w:jc w:val="left"/>
             </w:pPr>
             <w:r>
               <w:rPr>
-                <w:rFonts w:ascii="Times New Roman" w:hAnsi="Times New Roman"/>
-                <w:b/>
+                <w:rFonts w:ascii="Cambria" w:hAnsi="Cambria"/>
                 <w:color w:val="000000"/>
                 <w:sz w:val="19"/>
               </w:rPr>
-              <w:t>Children_Ever_Born</w:t>
+              <w:t>Children ever born</w:t>
             </w:r>
           </w:p>
         </w:tc>
         <w:tc>
           <w:tcPr>
-            <w:tcW w:type="dxa" w:w="1728"/>
+            <w:tcW w:type="dxa" w:w="2015"/>
             <w:tcMar>
               <w:top w:w="80" w:type="dxa"/>
               <w:bottom w:w="80" w:type="dxa"/>
@@ -717,15 +767,16 @@
               <w:left w:val="none"/>
               <w:right w:val="none"/>
             </w:tcBorders>
+            <w:shd w:fill="FFFFFF" w:val="clear"/>
           </w:tcPr>
           <w:p>
             <w:pPr>
-              <w:spacing w:after="40" w:line="240" w:lineRule="auto"/>
-              <w:jc w:val="left"/>
+              <w:spacing w:after="0" w:line="276" w:lineRule="auto" w:before="0"/>
+              <w:jc w:val="center"/>
             </w:pPr>
             <w:r>
               <w:rPr>
-                <w:rFonts w:ascii="Times New Roman" w:hAnsi="Times New Roman"/>
+                <w:rFonts w:ascii="Cambria" w:hAnsi="Cambria"/>
                 <w:color w:val="000000"/>
                 <w:sz w:val="19"/>
               </w:rPr>
@@ -735,7 +786,7 @@
         </w:tc>
         <w:tc>
           <w:tcPr>
-            <w:tcW w:type="dxa" w:w="1152"/>
+            <w:tcW w:type="dxa" w:w="2015"/>
             <w:tcMar>
               <w:top w:w="80" w:type="dxa"/>
               <w:bottom w:w="80" w:type="dxa"/>
@@ -748,15 +799,16 @@
               <w:left w:val="none"/>
               <w:right w:val="none"/>
             </w:tcBorders>
+            <w:shd w:fill="FFFFFF" w:val="clear"/>
           </w:tcPr>
           <w:p>
             <w:pPr>
-              <w:spacing w:after="40" w:line="240" w:lineRule="auto"/>
+              <w:spacing w:after="0" w:line="276" w:lineRule="auto" w:before="0"/>
               <w:jc w:val="center"/>
             </w:pPr>
             <w:r>
               <w:rPr>
-                <w:rFonts w:ascii="Times New Roman" w:hAnsi="Times New Roman"/>
+                <w:rFonts w:ascii="Cambria" w:hAnsi="Cambria"/>
                 <w:color w:val="000000"/>
                 <w:sz w:val="19"/>
               </w:rPr>
@@ -779,15 +831,16 @@
               <w:left w:val="none"/>
               <w:right w:val="none"/>
             </w:tcBorders>
+            <w:shd w:fill="FFFFFF" w:val="clear"/>
           </w:tcPr>
           <w:p>
             <w:pPr>
-              <w:spacing w:after="40" w:line="240" w:lineRule="auto"/>
+              <w:spacing w:after="0" w:line="276" w:lineRule="auto" w:before="0"/>
               <w:jc w:val="center"/>
             </w:pPr>
             <w:r>
               <w:rPr>
-                <w:rFonts w:ascii="Times New Roman" w:hAnsi="Times New Roman"/>
+                <w:rFonts w:ascii="Cambria" w:hAnsi="Cambria"/>
                 <w:color w:val="000000"/>
                 <w:sz w:val="19"/>
               </w:rPr>
@@ -797,9 +850,12 @@
         </w:tc>
       </w:tr>
       <w:tr>
+        <w:trPr>
+          <w:cantSplit/>
+        </w:trPr>
         <w:tc>
           <w:tcPr>
-            <w:tcW w:type="dxa" w:w="4320"/>
+            <w:tcW w:type="dxa" w:w="3600"/>
             <w:tcMar>
               <w:top w:w="80" w:type="dxa"/>
               <w:bottom w:w="80" w:type="dxa"/>
@@ -812,26 +868,26 @@
               <w:left w:val="none"/>
               <w:right w:val="none"/>
             </w:tcBorders>
+            <w:shd w:fill="FFFFFF" w:val="clear"/>
           </w:tcPr>
           <w:p>
             <w:pPr>
-              <w:spacing w:after="40" w:line="240" w:lineRule="auto"/>
+              <w:spacing w:before="0" w:after="0" w:line="276" w:lineRule="auto"/>
               <w:jc w:val="left"/>
             </w:pPr>
             <w:r>
               <w:rPr>
-                <w:rFonts w:ascii="Times New Roman" w:hAnsi="Times New Roman"/>
-                <w:b/>
+                <w:rFonts w:ascii="Cambria" w:hAnsi="Cambria"/>
                 <w:color w:val="000000"/>
                 <w:sz w:val="19"/>
               </w:rPr>
-              <w:t>Currently_Pregnant</w:t>
+              <w:t>Currently pregnant</w:t>
             </w:r>
           </w:p>
         </w:tc>
         <w:tc>
           <w:tcPr>
-            <w:tcW w:type="dxa" w:w="1728"/>
+            <w:tcW w:type="dxa" w:w="2015"/>
             <w:tcMar>
               <w:top w:w="80" w:type="dxa"/>
               <w:bottom w:w="80" w:type="dxa"/>
@@ -844,15 +900,16 @@
               <w:left w:val="none"/>
               <w:right w:val="none"/>
             </w:tcBorders>
+            <w:shd w:fill="FFFFFF" w:val="clear"/>
           </w:tcPr>
           <w:p>
             <w:pPr>
-              <w:spacing w:after="40" w:line="240" w:lineRule="auto"/>
-              <w:jc w:val="left"/>
+              <w:spacing w:after="0" w:line="276" w:lineRule="auto" w:before="0"/>
+              <w:jc w:val="center"/>
             </w:pPr>
             <w:r>
               <w:rPr>
-                <w:rFonts w:ascii="Times New Roman" w:hAnsi="Times New Roman"/>
+                <w:rFonts w:ascii="Cambria" w:hAnsi="Cambria"/>
                 <w:color w:val="000000"/>
                 <w:sz w:val="19"/>
               </w:rPr>
@@ -862,7 +919,7 @@
         </w:tc>
         <w:tc>
           <w:tcPr>
-            <w:tcW w:type="dxa" w:w="1152"/>
+            <w:tcW w:type="dxa" w:w="2015"/>
             <w:tcMar>
               <w:top w:w="80" w:type="dxa"/>
               <w:bottom w:w="80" w:type="dxa"/>
@@ -875,15 +932,16 @@
               <w:left w:val="none"/>
               <w:right w:val="none"/>
             </w:tcBorders>
+            <w:shd w:fill="FFFFFF" w:val="clear"/>
           </w:tcPr>
           <w:p>
             <w:pPr>
-              <w:spacing w:after="40" w:line="240" w:lineRule="auto"/>
+              <w:spacing w:after="0" w:line="276" w:lineRule="auto" w:before="0"/>
               <w:jc w:val="center"/>
             </w:pPr>
             <w:r>
               <w:rPr>
-                <w:rFonts w:ascii="Times New Roman" w:hAnsi="Times New Roman"/>
+                <w:rFonts w:ascii="Cambria" w:hAnsi="Cambria"/>
                 <w:color w:val="000000"/>
                 <w:sz w:val="19"/>
               </w:rPr>
@@ -906,15 +964,16 @@
               <w:left w:val="none"/>
               <w:right w:val="none"/>
             </w:tcBorders>
+            <w:shd w:fill="FFFFFF" w:val="clear"/>
           </w:tcPr>
           <w:p>
             <w:pPr>
-              <w:spacing w:after="40" w:line="240" w:lineRule="auto"/>
+              <w:spacing w:after="0" w:line="276" w:lineRule="auto" w:before="0"/>
               <w:jc w:val="center"/>
             </w:pPr>
             <w:r>
               <w:rPr>
-                <w:rFonts w:ascii="Times New Roman" w:hAnsi="Times New Roman"/>
+                <w:rFonts w:ascii="Cambria" w:hAnsi="Cambria"/>
                 <w:color w:val="000000"/>
                 <w:sz w:val="19"/>
               </w:rPr>
@@ -924,9 +983,12 @@
         </w:tc>
       </w:tr>
       <w:tr>
+        <w:trPr>
+          <w:cantSplit/>
+        </w:trPr>
         <w:tc>
           <w:tcPr>
-            <w:tcW w:type="dxa" w:w="4320"/>
+            <w:tcW w:type="dxa" w:w="3600"/>
             <w:tcMar>
               <w:top w:w="80" w:type="dxa"/>
               <w:bottom w:w="80" w:type="dxa"/>
@@ -939,26 +1001,26 @@
               <w:left w:val="none"/>
               <w:right w:val="none"/>
             </w:tcBorders>
+            <w:shd w:fill="FFFFFF" w:val="clear"/>
           </w:tcPr>
           <w:p>
             <w:pPr>
-              <w:spacing w:after="40" w:line="240" w:lineRule="auto"/>
+              <w:spacing w:before="0" w:after="0" w:line="276" w:lineRule="auto"/>
               <w:jc w:val="left"/>
             </w:pPr>
             <w:r>
               <w:rPr>
-                <w:rFonts w:ascii="Times New Roman" w:hAnsi="Times New Roman"/>
-                <w:b/>
+                <w:rFonts w:ascii="Cambria" w:hAnsi="Cambria"/>
                 <w:color w:val="000000"/>
                 <w:sz w:val="19"/>
               </w:rPr>
-              <w:t>Living_Children</w:t>
+              <w:t>Number of living children</w:t>
             </w:r>
           </w:p>
         </w:tc>
         <w:tc>
           <w:tcPr>
-            <w:tcW w:type="dxa" w:w="1728"/>
+            <w:tcW w:type="dxa" w:w="2015"/>
             <w:tcMar>
               <w:top w:w="80" w:type="dxa"/>
               <w:bottom w:w="80" w:type="dxa"/>
@@ -971,15 +1033,16 @@
               <w:left w:val="none"/>
               <w:right w:val="none"/>
             </w:tcBorders>
+            <w:shd w:fill="FFFFFF" w:val="clear"/>
           </w:tcPr>
           <w:p>
             <w:pPr>
-              <w:spacing w:after="40" w:line="240" w:lineRule="auto"/>
-              <w:jc w:val="left"/>
+              <w:spacing w:after="0" w:line="276" w:lineRule="auto" w:before="0"/>
+              <w:jc w:val="center"/>
             </w:pPr>
             <w:r>
               <w:rPr>
-                <w:rFonts w:ascii="Times New Roman" w:hAnsi="Times New Roman"/>
+                <w:rFonts w:ascii="Cambria" w:hAnsi="Cambria"/>
                 <w:color w:val="000000"/>
                 <w:sz w:val="19"/>
               </w:rPr>
@@ -989,7 +1052,7 @@
         </w:tc>
         <w:tc>
           <w:tcPr>
-            <w:tcW w:type="dxa" w:w="1152"/>
+            <w:tcW w:type="dxa" w:w="2015"/>
             <w:tcMar>
               <w:top w:w="80" w:type="dxa"/>
               <w:bottom w:w="80" w:type="dxa"/>
@@ -1002,15 +1065,16 @@
               <w:left w:val="none"/>
               <w:right w:val="none"/>
             </w:tcBorders>
+            <w:shd w:fill="FFFFFF" w:val="clear"/>
           </w:tcPr>
           <w:p>
             <w:pPr>
-              <w:spacing w:after="40" w:line="240" w:lineRule="auto"/>
+              <w:spacing w:after="0" w:line="276" w:lineRule="auto" w:before="0"/>
               <w:jc w:val="center"/>
             </w:pPr>
             <w:r>
               <w:rPr>
-                <w:rFonts w:ascii="Times New Roman" w:hAnsi="Times New Roman"/>
+                <w:rFonts w:ascii="Cambria" w:hAnsi="Cambria"/>
                 <w:color w:val="000000"/>
                 <w:sz w:val="19"/>
               </w:rPr>
@@ -1033,15 +1097,16 @@
               <w:left w:val="none"/>
               <w:right w:val="none"/>
             </w:tcBorders>
+            <w:shd w:fill="FFFFFF" w:val="clear"/>
           </w:tcPr>
           <w:p>
             <w:pPr>
-              <w:spacing w:after="40" w:line="240" w:lineRule="auto"/>
+              <w:spacing w:after="0" w:line="276" w:lineRule="auto" w:before="0"/>
               <w:jc w:val="center"/>
             </w:pPr>
             <w:r>
               <w:rPr>
-                <w:rFonts w:ascii="Times New Roman" w:hAnsi="Times New Roman"/>
+                <w:rFonts w:ascii="Cambria" w:hAnsi="Cambria"/>
                 <w:color w:val="000000"/>
                 <w:sz w:val="19"/>
               </w:rPr>
@@ -1051,9 +1116,12 @@
         </w:tc>
       </w:tr>
       <w:tr>
+        <w:trPr>
+          <w:cantSplit/>
+        </w:trPr>
         <w:tc>
           <w:tcPr>
-            <w:tcW w:type="dxa" w:w="4320"/>
+            <w:tcW w:type="dxa" w:w="3600"/>
             <w:tcMar>
               <w:top w:w="80" w:type="dxa"/>
               <w:bottom w:w="80" w:type="dxa"/>
@@ -1066,26 +1134,26 @@
               <w:left w:val="none"/>
               <w:right w:val="none"/>
             </w:tcBorders>
+            <w:shd w:fill="FFFFFF" w:val="clear"/>
           </w:tcPr>
           <w:p>
             <w:pPr>
-              <w:spacing w:after="40" w:line="240" w:lineRule="auto"/>
+              <w:spacing w:before="0" w:after="0" w:line="276" w:lineRule="auto"/>
               <w:jc w:val="left"/>
             </w:pPr>
             <w:r>
               <w:rPr>
-                <w:rFonts w:ascii="Times New Roman" w:hAnsi="Times New Roman"/>
-                <w:b/>
+                <w:rFonts w:ascii="Cambria" w:hAnsi="Cambria"/>
                 <w:color w:val="000000"/>
                 <w:sz w:val="19"/>
               </w:rPr>
-              <w:t>Wealth_Index</w:t>
+              <w:t>Wealth index</w:t>
             </w:r>
           </w:p>
         </w:tc>
         <w:tc>
           <w:tcPr>
-            <w:tcW w:type="dxa" w:w="1728"/>
+            <w:tcW w:type="dxa" w:w="2015"/>
             <w:tcMar>
               <w:top w:w="80" w:type="dxa"/>
               <w:bottom w:w="80" w:type="dxa"/>
@@ -1098,15 +1166,16 @@
               <w:left w:val="none"/>
               <w:right w:val="none"/>
             </w:tcBorders>
+            <w:shd w:fill="FFFFFF" w:val="clear"/>
           </w:tcPr>
           <w:p>
             <w:pPr>
-              <w:spacing w:after="40" w:line="240" w:lineRule="auto"/>
-              <w:jc w:val="left"/>
+              <w:spacing w:after="0" w:line="276" w:lineRule="auto" w:before="0"/>
+              <w:jc w:val="center"/>
             </w:pPr>
             <w:r>
               <w:rPr>
-                <w:rFonts w:ascii="Times New Roman" w:hAnsi="Times New Roman"/>
+                <w:rFonts w:ascii="Cambria" w:hAnsi="Cambria"/>
                 <w:color w:val="000000"/>
                 <w:sz w:val="19"/>
               </w:rPr>
@@ -1116,7 +1185,7 @@
         </w:tc>
         <w:tc>
           <w:tcPr>
-            <w:tcW w:type="dxa" w:w="1152"/>
+            <w:tcW w:type="dxa" w:w="2015"/>
             <w:tcMar>
               <w:top w:w="80" w:type="dxa"/>
               <w:bottom w:w="80" w:type="dxa"/>
@@ -1129,15 +1198,16 @@
               <w:left w:val="none"/>
               <w:right w:val="none"/>
             </w:tcBorders>
+            <w:shd w:fill="FFFFFF" w:val="clear"/>
           </w:tcPr>
           <w:p>
             <w:pPr>
-              <w:spacing w:after="40" w:line="240" w:lineRule="auto"/>
+              <w:spacing w:after="0" w:line="276" w:lineRule="auto" w:before="0"/>
               <w:jc w:val="center"/>
             </w:pPr>
             <w:r>
               <w:rPr>
-                <w:rFonts w:ascii="Times New Roman" w:hAnsi="Times New Roman"/>
+                <w:rFonts w:ascii="Cambria" w:hAnsi="Cambria"/>
                 <w:color w:val="000000"/>
                 <w:sz w:val="19"/>
               </w:rPr>
@@ -1160,15 +1230,16 @@
               <w:left w:val="none"/>
               <w:right w:val="none"/>
             </w:tcBorders>
+            <w:shd w:fill="FFFFFF" w:val="clear"/>
           </w:tcPr>
           <w:p>
             <w:pPr>
-              <w:spacing w:after="40" w:line="240" w:lineRule="auto"/>
+              <w:spacing w:after="0" w:line="276" w:lineRule="auto" w:before="0"/>
               <w:jc w:val="center"/>
             </w:pPr>
             <w:r>
               <w:rPr>
-                <w:rFonts w:ascii="Times New Roman" w:hAnsi="Times New Roman"/>
+                <w:rFonts w:ascii="Cambria" w:hAnsi="Cambria"/>
                 <w:color w:val="000000"/>
                 <w:sz w:val="19"/>
               </w:rPr>
@@ -1178,9 +1249,12 @@
         </w:tc>
       </w:tr>
       <w:tr>
+        <w:trPr>
+          <w:cantSplit/>
+        </w:trPr>
         <w:tc>
           <w:tcPr>
-            <w:tcW w:type="dxa" w:w="4320"/>
+            <w:tcW w:type="dxa" w:w="3600"/>
             <w:tcMar>
               <w:top w:w="80" w:type="dxa"/>
               <w:bottom w:w="80" w:type="dxa"/>
@@ -1193,26 +1267,26 @@
               <w:left w:val="none"/>
               <w:right w:val="none"/>
             </w:tcBorders>
+            <w:shd w:fill="FFFFFF" w:val="clear"/>
           </w:tcPr>
           <w:p>
             <w:pPr>
-              <w:spacing w:after="40" w:line="240" w:lineRule="auto"/>
+              <w:spacing w:before="0" w:after="0" w:line="276" w:lineRule="auto"/>
               <w:jc w:val="left"/>
             </w:pPr>
             <w:r>
               <w:rPr>
-                <w:rFonts w:ascii="Times New Roman" w:hAnsi="Times New Roman"/>
-                <w:b/>
+                <w:rFonts w:ascii="Cambria" w:hAnsi="Cambria"/>
                 <w:color w:val="000000"/>
                 <w:sz w:val="19"/>
               </w:rPr>
-              <w:t>Toilet_Facility</w:t>
+              <w:t>Toilet facility</w:t>
             </w:r>
           </w:p>
         </w:tc>
         <w:tc>
           <w:tcPr>
-            <w:tcW w:type="dxa" w:w="1728"/>
+            <w:tcW w:type="dxa" w:w="2015"/>
             <w:tcMar>
               <w:top w:w="80" w:type="dxa"/>
               <w:bottom w:w="80" w:type="dxa"/>
@@ -1225,15 +1299,16 @@
               <w:left w:val="none"/>
               <w:right w:val="none"/>
             </w:tcBorders>
+            <w:shd w:fill="FFFFFF" w:val="clear"/>
           </w:tcPr>
           <w:p>
             <w:pPr>
-              <w:spacing w:after="40" w:line="240" w:lineRule="auto"/>
-              <w:jc w:val="left"/>
+              <w:spacing w:after="0" w:line="276" w:lineRule="auto" w:before="0"/>
+              <w:jc w:val="center"/>
             </w:pPr>
             <w:r>
               <w:rPr>
-                <w:rFonts w:ascii="Times New Roman" w:hAnsi="Times New Roman"/>
+                <w:rFonts w:ascii="Cambria" w:hAnsi="Cambria"/>
                 <w:color w:val="000000"/>
                 <w:sz w:val="19"/>
               </w:rPr>
@@ -1243,7 +1318,7 @@
         </w:tc>
         <w:tc>
           <w:tcPr>
-            <w:tcW w:type="dxa" w:w="1152"/>
+            <w:tcW w:type="dxa" w:w="2015"/>
             <w:tcMar>
               <w:top w:w="80" w:type="dxa"/>
               <w:bottom w:w="80" w:type="dxa"/>
@@ -1256,15 +1331,16 @@
               <w:left w:val="none"/>
               <w:right w:val="none"/>
             </w:tcBorders>
+            <w:shd w:fill="FFFFFF" w:val="clear"/>
           </w:tcPr>
           <w:p>
             <w:pPr>
-              <w:spacing w:after="40" w:line="240" w:lineRule="auto"/>
+              <w:spacing w:after="0" w:line="276" w:lineRule="auto" w:before="0"/>
               <w:jc w:val="center"/>
             </w:pPr>
             <w:r>
               <w:rPr>
-                <w:rFonts w:ascii="Times New Roman" w:hAnsi="Times New Roman"/>
+                <w:rFonts w:ascii="Cambria" w:hAnsi="Cambria"/>
                 <w:color w:val="000000"/>
                 <w:sz w:val="19"/>
               </w:rPr>
@@ -1287,15 +1363,16 @@
               <w:left w:val="none"/>
               <w:right w:val="none"/>
             </w:tcBorders>
+            <w:shd w:fill="FFFFFF" w:val="clear"/>
           </w:tcPr>
           <w:p>
             <w:pPr>
-              <w:spacing w:after="40" w:line="240" w:lineRule="auto"/>
+              <w:spacing w:after="0" w:line="276" w:lineRule="auto" w:before="0"/>
               <w:jc w:val="center"/>
             </w:pPr>
             <w:r>
               <w:rPr>
-                <w:rFonts w:ascii="Times New Roman" w:hAnsi="Times New Roman"/>
+                <w:rFonts w:ascii="Cambria" w:hAnsi="Cambria"/>
                 <w:color w:val="000000"/>
                 <w:sz w:val="19"/>
               </w:rPr>
@@ -1305,9 +1382,12 @@
         </w:tc>
       </w:tr>
       <w:tr>
+        <w:trPr>
+          <w:cantSplit/>
+        </w:trPr>
         <w:tc>
           <w:tcPr>
-            <w:tcW w:type="dxa" w:w="4320"/>
+            <w:tcW w:type="dxa" w:w="3600"/>
             <w:tcMar>
               <w:top w:w="80" w:type="dxa"/>
               <w:bottom w:w="80" w:type="dxa"/>
@@ -1320,26 +1400,26 @@
               <w:left w:val="none"/>
               <w:right w:val="none"/>
             </w:tcBorders>
+            <w:shd w:fill="FFFFFF" w:val="clear"/>
           </w:tcPr>
           <w:p>
             <w:pPr>
-              <w:spacing w:after="40" w:line="240" w:lineRule="auto"/>
+              <w:spacing w:before="0" w:after="0" w:line="276" w:lineRule="auto"/>
               <w:jc w:val="left"/>
             </w:pPr>
             <w:r>
               <w:rPr>
-                <w:rFonts w:ascii="Times New Roman" w:hAnsi="Times New Roman"/>
-                <w:b/>
+                <w:rFonts w:ascii="Cambria" w:hAnsi="Cambria"/>
                 <w:color w:val="000000"/>
                 <w:sz w:val="19"/>
               </w:rPr>
-              <w:t>Electricity</w:t>
+              <w:t>Electricity in household</w:t>
             </w:r>
           </w:p>
         </w:tc>
         <w:tc>
           <w:tcPr>
-            <w:tcW w:type="dxa" w:w="1728"/>
+            <w:tcW w:type="dxa" w:w="2015"/>
             <w:tcMar>
               <w:top w:w="80" w:type="dxa"/>
               <w:bottom w:w="80" w:type="dxa"/>
@@ -1352,15 +1432,16 @@
               <w:left w:val="none"/>
               <w:right w:val="none"/>
             </w:tcBorders>
+            <w:shd w:fill="FFFFFF" w:val="clear"/>
           </w:tcPr>
           <w:p>
             <w:pPr>
-              <w:spacing w:after="40" w:line="240" w:lineRule="auto"/>
-              <w:jc w:val="left"/>
+              <w:spacing w:after="0" w:line="276" w:lineRule="auto" w:before="0"/>
+              <w:jc w:val="center"/>
             </w:pPr>
             <w:r>
               <w:rPr>
-                <w:rFonts w:ascii="Times New Roman" w:hAnsi="Times New Roman"/>
+                <w:rFonts w:ascii="Cambria" w:hAnsi="Cambria"/>
                 <w:color w:val="000000"/>
                 <w:sz w:val="19"/>
               </w:rPr>
@@ -1370,7 +1451,7 @@
         </w:tc>
         <w:tc>
           <w:tcPr>
-            <w:tcW w:type="dxa" w:w="1152"/>
+            <w:tcW w:type="dxa" w:w="2015"/>
             <w:tcMar>
               <w:top w:w="80" w:type="dxa"/>
               <w:bottom w:w="80" w:type="dxa"/>
@@ -1383,15 +1464,16 @@
               <w:left w:val="none"/>
               <w:right w:val="none"/>
             </w:tcBorders>
+            <w:shd w:fill="FFFFFF" w:val="clear"/>
           </w:tcPr>
           <w:p>
             <w:pPr>
-              <w:spacing w:after="40" w:line="240" w:lineRule="auto"/>
+              <w:spacing w:after="0" w:line="276" w:lineRule="auto" w:before="0"/>
               <w:jc w:val="center"/>
             </w:pPr>
             <w:r>
               <w:rPr>
-                <w:rFonts w:ascii="Times New Roman" w:hAnsi="Times New Roman"/>
+                <w:rFonts w:ascii="Cambria" w:hAnsi="Cambria"/>
                 <w:color w:val="000000"/>
                 <w:sz w:val="19"/>
               </w:rPr>
@@ -1414,15 +1496,16 @@
               <w:left w:val="none"/>
               <w:right w:val="none"/>
             </w:tcBorders>
+            <w:shd w:fill="FFFFFF" w:val="clear"/>
           </w:tcPr>
           <w:p>
             <w:pPr>
-              <w:spacing w:after="40" w:line="240" w:lineRule="auto"/>
+              <w:spacing w:after="0" w:line="276" w:lineRule="auto" w:before="0"/>
               <w:jc w:val="center"/>
             </w:pPr>
             <w:r>
               <w:rPr>
-                <w:rFonts w:ascii="Times New Roman" w:hAnsi="Times New Roman"/>
+                <w:rFonts w:ascii="Cambria" w:hAnsi="Cambria"/>
                 <w:color w:val="000000"/>
                 <w:sz w:val="19"/>
               </w:rPr>
@@ -1432,9 +1515,12 @@
         </w:tc>
       </w:tr>
       <w:tr>
+        <w:trPr>
+          <w:cantSplit/>
+        </w:trPr>
         <w:tc>
           <w:tcPr>
-            <w:tcW w:type="dxa" w:w="4320"/>
+            <w:tcW w:type="dxa" w:w="3600"/>
             <w:tcMar>
               <w:top w:w="80" w:type="dxa"/>
               <w:bottom w:w="80" w:type="dxa"/>
@@ -1447,26 +1533,26 @@
               <w:left w:val="none"/>
               <w:right w:val="none"/>
             </w:tcBorders>
+            <w:shd w:fill="FFFFFF" w:val="clear"/>
           </w:tcPr>
           <w:p>
             <w:pPr>
-              <w:spacing w:after="40" w:line="240" w:lineRule="auto"/>
+              <w:spacing w:before="0" w:after="0" w:line="276" w:lineRule="auto"/>
               <w:jc w:val="left"/>
             </w:pPr>
             <w:r>
               <w:rPr>
-                <w:rFonts w:ascii="Times New Roman" w:hAnsi="Times New Roman"/>
-                <w:b/>
+                <w:rFonts w:ascii="Cambria" w:hAnsi="Cambria"/>
                 <w:color w:val="000000"/>
                 <w:sz w:val="19"/>
               </w:rPr>
-              <w:t>Owns_TV</w:t>
+              <w:t>Owns TV</w:t>
             </w:r>
           </w:p>
         </w:tc>
         <w:tc>
           <w:tcPr>
-            <w:tcW w:type="dxa" w:w="1728"/>
+            <w:tcW w:type="dxa" w:w="2015"/>
             <w:tcMar>
               <w:top w:w="80" w:type="dxa"/>
               <w:bottom w:w="80" w:type="dxa"/>
@@ -1479,15 +1565,16 @@
               <w:left w:val="none"/>
               <w:right w:val="none"/>
             </w:tcBorders>
+            <w:shd w:fill="FFFFFF" w:val="clear"/>
           </w:tcPr>
           <w:p>
             <w:pPr>
-              <w:spacing w:after="40" w:line="240" w:lineRule="auto"/>
-              <w:jc w:val="left"/>
+              <w:spacing w:after="0" w:line="276" w:lineRule="auto" w:before="0"/>
+              <w:jc w:val="center"/>
             </w:pPr>
             <w:r>
               <w:rPr>
-                <w:rFonts w:ascii="Times New Roman" w:hAnsi="Times New Roman"/>
+                <w:rFonts w:ascii="Cambria" w:hAnsi="Cambria"/>
                 <w:color w:val="000000"/>
                 <w:sz w:val="19"/>
               </w:rPr>
@@ -1497,7 +1584,7 @@
         </w:tc>
         <w:tc>
           <w:tcPr>
-            <w:tcW w:type="dxa" w:w="1152"/>
+            <w:tcW w:type="dxa" w:w="2015"/>
             <w:tcMar>
               <w:top w:w="80" w:type="dxa"/>
               <w:bottom w:w="80" w:type="dxa"/>
@@ -1510,15 +1597,16 @@
               <w:left w:val="none"/>
               <w:right w:val="none"/>
             </w:tcBorders>
+            <w:shd w:fill="FFFFFF" w:val="clear"/>
           </w:tcPr>
           <w:p>
             <w:pPr>
-              <w:spacing w:after="40" w:line="240" w:lineRule="auto"/>
+              <w:spacing w:after="0" w:line="276" w:lineRule="auto" w:before="0"/>
               <w:jc w:val="center"/>
             </w:pPr>
             <w:r>
               <w:rPr>
-                <w:rFonts w:ascii="Times New Roman" w:hAnsi="Times New Roman"/>
+                <w:rFonts w:ascii="Cambria" w:hAnsi="Cambria"/>
                 <w:color w:val="000000"/>
                 <w:sz w:val="19"/>
               </w:rPr>
@@ -1541,15 +1629,16 @@
               <w:left w:val="none"/>
               <w:right w:val="none"/>
             </w:tcBorders>
+            <w:shd w:fill="FFFFFF" w:val="clear"/>
           </w:tcPr>
           <w:p>
             <w:pPr>
-              <w:spacing w:after="40" w:line="240" w:lineRule="auto"/>
+              <w:spacing w:after="0" w:line="276" w:lineRule="auto" w:before="0"/>
               <w:jc w:val="center"/>
             </w:pPr>
             <w:r>
               <w:rPr>
-                <w:rFonts w:ascii="Times New Roman" w:hAnsi="Times New Roman"/>
+                <w:rFonts w:ascii="Cambria" w:hAnsi="Cambria"/>
                 <w:color w:val="000000"/>
                 <w:sz w:val="19"/>
               </w:rPr>
@@ -1559,9 +1648,12 @@
         </w:tc>
       </w:tr>
       <w:tr>
+        <w:trPr>
+          <w:cantSplit/>
+        </w:trPr>
         <w:tc>
           <w:tcPr>
-            <w:tcW w:type="dxa" w:w="4320"/>
+            <w:tcW w:type="dxa" w:w="3600"/>
             <w:tcMar>
               <w:top w:w="80" w:type="dxa"/>
               <w:bottom w:w="80" w:type="dxa"/>
@@ -1574,26 +1666,26 @@
               <w:left w:val="none"/>
               <w:right w:val="none"/>
             </w:tcBorders>
+            <w:shd w:fill="FFFFFF" w:val="clear"/>
           </w:tcPr>
           <w:p>
             <w:pPr>
-              <w:spacing w:after="40" w:line="240" w:lineRule="auto"/>
+              <w:spacing w:before="0" w:after="0" w:line="276" w:lineRule="auto"/>
               <w:jc w:val="left"/>
             </w:pPr>
             <w:r>
               <w:rPr>
-                <w:rFonts w:ascii="Times New Roman" w:hAnsi="Times New Roman"/>
-                <w:b/>
+                <w:rFonts w:ascii="Cambria" w:hAnsi="Cambria"/>
                 <w:color w:val="000000"/>
                 <w:sz w:val="19"/>
               </w:rPr>
-              <w:t>Owns_Refrigerator</w:t>
+              <w:t>Owns refrigerator</w:t>
             </w:r>
           </w:p>
         </w:tc>
         <w:tc>
           <w:tcPr>
-            <w:tcW w:type="dxa" w:w="1728"/>
+            <w:tcW w:type="dxa" w:w="2015"/>
             <w:tcMar>
               <w:top w:w="80" w:type="dxa"/>
               <w:bottom w:w="80" w:type="dxa"/>
@@ -1606,15 +1698,16 @@
               <w:left w:val="none"/>
               <w:right w:val="none"/>
             </w:tcBorders>
+            <w:shd w:fill="FFFFFF" w:val="clear"/>
           </w:tcPr>
           <w:p>
             <w:pPr>
-              <w:spacing w:after="40" w:line="240" w:lineRule="auto"/>
-              <w:jc w:val="left"/>
+              <w:spacing w:after="0" w:line="276" w:lineRule="auto" w:before="0"/>
+              <w:jc w:val="center"/>
             </w:pPr>
             <w:r>
               <w:rPr>
-                <w:rFonts w:ascii="Times New Roman" w:hAnsi="Times New Roman"/>
+                <w:rFonts w:ascii="Cambria" w:hAnsi="Cambria"/>
                 <w:color w:val="000000"/>
                 <w:sz w:val="19"/>
               </w:rPr>
@@ -1624,7 +1717,7 @@
         </w:tc>
         <w:tc>
           <w:tcPr>
-            <w:tcW w:type="dxa" w:w="1152"/>
+            <w:tcW w:type="dxa" w:w="2015"/>
             <w:tcMar>
               <w:top w:w="80" w:type="dxa"/>
               <w:bottom w:w="80" w:type="dxa"/>
@@ -1637,15 +1730,16 @@
               <w:left w:val="none"/>
               <w:right w:val="none"/>
             </w:tcBorders>
+            <w:shd w:fill="FFFFFF" w:val="clear"/>
           </w:tcPr>
           <w:p>
             <w:pPr>
-              <w:spacing w:after="40" w:line="240" w:lineRule="auto"/>
+              <w:spacing w:after="0" w:line="276" w:lineRule="auto" w:before="0"/>
               <w:jc w:val="center"/>
             </w:pPr>
             <w:r>
               <w:rPr>
-                <w:rFonts w:ascii="Times New Roman" w:hAnsi="Times New Roman"/>
+                <w:rFonts w:ascii="Cambria" w:hAnsi="Cambria"/>
                 <w:color w:val="000000"/>
                 <w:sz w:val="19"/>
               </w:rPr>
@@ -1668,15 +1762,16 @@
               <w:left w:val="none"/>
               <w:right w:val="none"/>
             </w:tcBorders>
+            <w:shd w:fill="FFFFFF" w:val="clear"/>
           </w:tcPr>
           <w:p>
             <w:pPr>
-              <w:spacing w:after="40" w:line="240" w:lineRule="auto"/>
+              <w:spacing w:after="0" w:line="276" w:lineRule="auto" w:before="0"/>
               <w:jc w:val="center"/>
             </w:pPr>
             <w:r>
               <w:rPr>
-                <w:rFonts w:ascii="Times New Roman" w:hAnsi="Times New Roman"/>
+                <w:rFonts w:ascii="Cambria" w:hAnsi="Cambria"/>
                 <w:color w:val="000000"/>
                 <w:sz w:val="19"/>
               </w:rPr>
@@ -1686,9 +1781,12 @@
         </w:tc>
       </w:tr>
       <w:tr>
+        <w:trPr>
+          <w:cantSplit/>
+        </w:trPr>
         <w:tc>
           <w:tcPr>
-            <w:tcW w:type="dxa" w:w="4320"/>
+            <w:tcW w:type="dxa" w:w="3600"/>
             <w:tcMar>
               <w:top w:w="80" w:type="dxa"/>
               <w:bottom w:w="80" w:type="dxa"/>
@@ -1701,26 +1799,26 @@
               <w:left w:val="none"/>
               <w:right w:val="none"/>
             </w:tcBorders>
+            <w:shd w:fill="FFFFFF" w:val="clear"/>
           </w:tcPr>
           <w:p>
             <w:pPr>
-              <w:spacing w:after="40" w:line="240" w:lineRule="auto"/>
+              <w:spacing w:before="0" w:after="0" w:line="276" w:lineRule="auto"/>
               <w:jc w:val="left"/>
             </w:pPr>
             <w:r>
               <w:rPr>
-                <w:rFonts w:ascii="Times New Roman" w:hAnsi="Times New Roman"/>
-                <w:b/>
+                <w:rFonts w:ascii="Cambria" w:hAnsi="Cambria"/>
                 <w:color w:val="000000"/>
                 <w:sz w:val="19"/>
               </w:rPr>
-              <w:t>Owns_Bicycle</w:t>
+              <w:t>Owns Bicycle</w:t>
             </w:r>
           </w:p>
         </w:tc>
         <w:tc>
           <w:tcPr>
-            <w:tcW w:type="dxa" w:w="1728"/>
+            <w:tcW w:type="dxa" w:w="2015"/>
             <w:tcMar>
               <w:top w:w="80" w:type="dxa"/>
               <w:bottom w:w="80" w:type="dxa"/>
@@ -1733,15 +1831,16 @@
               <w:left w:val="none"/>
               <w:right w:val="none"/>
             </w:tcBorders>
+            <w:shd w:fill="FFFFFF" w:val="clear"/>
           </w:tcPr>
           <w:p>
             <w:pPr>
-              <w:spacing w:after="40" w:line="240" w:lineRule="auto"/>
-              <w:jc w:val="left"/>
+              <w:spacing w:after="0" w:line="276" w:lineRule="auto" w:before="0"/>
+              <w:jc w:val="center"/>
             </w:pPr>
             <w:r>
               <w:rPr>
-                <w:rFonts w:ascii="Times New Roman" w:hAnsi="Times New Roman"/>
+                <w:rFonts w:ascii="Cambria" w:hAnsi="Cambria"/>
                 <w:color w:val="000000"/>
                 <w:sz w:val="19"/>
               </w:rPr>
@@ -1751,7 +1850,7 @@
         </w:tc>
         <w:tc>
           <w:tcPr>
-            <w:tcW w:type="dxa" w:w="1152"/>
+            <w:tcW w:type="dxa" w:w="2015"/>
             <w:tcMar>
               <w:top w:w="80" w:type="dxa"/>
               <w:bottom w:w="80" w:type="dxa"/>
@@ -1764,15 +1863,16 @@
               <w:left w:val="none"/>
               <w:right w:val="none"/>
             </w:tcBorders>
+            <w:shd w:fill="FFFFFF" w:val="clear"/>
           </w:tcPr>
           <w:p>
             <w:pPr>
-              <w:spacing w:after="40" w:line="240" w:lineRule="auto"/>
+              <w:spacing w:after="0" w:line="276" w:lineRule="auto" w:before="0"/>
               <w:jc w:val="center"/>
             </w:pPr>
             <w:r>
               <w:rPr>
-                <w:rFonts w:ascii="Times New Roman" w:hAnsi="Times New Roman"/>
+                <w:rFonts w:ascii="Cambria" w:hAnsi="Cambria"/>
                 <w:color w:val="000000"/>
                 <w:sz w:val="19"/>
               </w:rPr>
@@ -1795,15 +1895,16 @@
               <w:left w:val="none"/>
               <w:right w:val="none"/>
             </w:tcBorders>
+            <w:shd w:fill="FFFFFF" w:val="clear"/>
           </w:tcPr>
           <w:p>
             <w:pPr>
-              <w:spacing w:after="40" w:line="240" w:lineRule="auto"/>
+              <w:spacing w:after="0" w:line="276" w:lineRule="auto" w:before="0"/>
               <w:jc w:val="center"/>
             </w:pPr>
             <w:r>
               <w:rPr>
-                <w:rFonts w:ascii="Times New Roman" w:hAnsi="Times New Roman"/>
+                <w:rFonts w:ascii="Cambria" w:hAnsi="Cambria"/>
                 <w:color w:val="000000"/>
                 <w:sz w:val="19"/>
               </w:rPr>
@@ -1813,9 +1914,12 @@
         </w:tc>
       </w:tr>
       <w:tr>
+        <w:trPr>
+          <w:cantSplit/>
+        </w:trPr>
         <w:tc>
           <w:tcPr>
-            <w:tcW w:type="dxa" w:w="4320"/>
+            <w:tcW w:type="dxa" w:w="3600"/>
             <w:tcMar>
               <w:top w:w="80" w:type="dxa"/>
               <w:bottom w:w="80" w:type="dxa"/>
@@ -1828,26 +1932,26 @@
               <w:left w:val="none"/>
               <w:right w:val="none"/>
             </w:tcBorders>
+            <w:shd w:fill="FFFFFF" w:val="clear"/>
           </w:tcPr>
           <w:p>
             <w:pPr>
-              <w:spacing w:after="40" w:line="240" w:lineRule="auto"/>
+              <w:spacing w:before="0" w:after="0" w:line="276" w:lineRule="auto"/>
               <w:jc w:val="left"/>
             </w:pPr>
             <w:r>
               <w:rPr>
-                <w:rFonts w:ascii="Times New Roman" w:hAnsi="Times New Roman"/>
-                <w:b/>
+                <w:rFonts w:ascii="Cambria" w:hAnsi="Cambria"/>
                 <w:color w:val="000000"/>
                 <w:sz w:val="19"/>
               </w:rPr>
-              <w:t>Floor_Material</w:t>
+              <w:t>Floor material</w:t>
             </w:r>
           </w:p>
         </w:tc>
         <w:tc>
           <w:tcPr>
-            <w:tcW w:type="dxa" w:w="1728"/>
+            <w:tcW w:type="dxa" w:w="2015"/>
             <w:tcMar>
               <w:top w:w="80" w:type="dxa"/>
               <w:bottom w:w="80" w:type="dxa"/>
@@ -1860,15 +1964,16 @@
               <w:left w:val="none"/>
               <w:right w:val="none"/>
             </w:tcBorders>
+            <w:shd w:fill="FFFFFF" w:val="clear"/>
           </w:tcPr>
           <w:p>
             <w:pPr>
-              <w:spacing w:after="40" w:line="240" w:lineRule="auto"/>
-              <w:jc w:val="left"/>
+              <w:spacing w:after="0" w:line="276" w:lineRule="auto" w:before="0"/>
+              <w:jc w:val="center"/>
             </w:pPr>
             <w:r>
               <w:rPr>
-                <w:rFonts w:ascii="Times New Roman" w:hAnsi="Times New Roman"/>
+                <w:rFonts w:ascii="Cambria" w:hAnsi="Cambria"/>
                 <w:color w:val="000000"/>
                 <w:sz w:val="19"/>
               </w:rPr>
@@ -1878,7 +1983,7 @@
         </w:tc>
         <w:tc>
           <w:tcPr>
-            <w:tcW w:type="dxa" w:w="1152"/>
+            <w:tcW w:type="dxa" w:w="2015"/>
             <w:tcMar>
               <w:top w:w="80" w:type="dxa"/>
               <w:bottom w:w="80" w:type="dxa"/>
@@ -1891,15 +1996,16 @@
               <w:left w:val="none"/>
               <w:right w:val="none"/>
             </w:tcBorders>
+            <w:shd w:fill="FFFFFF" w:val="clear"/>
           </w:tcPr>
           <w:p>
             <w:pPr>
-              <w:spacing w:after="40" w:line="240" w:lineRule="auto"/>
+              <w:spacing w:after="0" w:line="276" w:lineRule="auto" w:before="0"/>
               <w:jc w:val="center"/>
             </w:pPr>
             <w:r>
               <w:rPr>
-                <w:rFonts w:ascii="Times New Roman" w:hAnsi="Times New Roman"/>
+                <w:rFonts w:ascii="Cambria" w:hAnsi="Cambria"/>
                 <w:color w:val="000000"/>
                 <w:sz w:val="19"/>
               </w:rPr>
@@ -1922,15 +2028,16 @@
               <w:left w:val="none"/>
               <w:right w:val="none"/>
             </w:tcBorders>
+            <w:shd w:fill="FFFFFF" w:val="clear"/>
           </w:tcPr>
           <w:p>
             <w:pPr>
-              <w:spacing w:after="40" w:line="240" w:lineRule="auto"/>
+              <w:spacing w:after="0" w:line="276" w:lineRule="auto" w:before="0"/>
               <w:jc w:val="center"/>
             </w:pPr>
             <w:r>
               <w:rPr>
-                <w:rFonts w:ascii="Times New Roman" w:hAnsi="Times New Roman"/>
+                <w:rFonts w:ascii="Cambria" w:hAnsi="Cambria"/>
                 <w:color w:val="000000"/>
                 <w:sz w:val="19"/>
               </w:rPr>
@@ -1940,9 +2047,12 @@
         </w:tc>
       </w:tr>
       <w:tr>
+        <w:trPr>
+          <w:cantSplit/>
+        </w:trPr>
         <w:tc>
           <w:tcPr>
-            <w:tcW w:type="dxa" w:w="4320"/>
+            <w:tcW w:type="dxa" w:w="3600"/>
             <w:tcMar>
               <w:top w:w="80" w:type="dxa"/>
               <w:bottom w:w="80" w:type="dxa"/>
@@ -1955,26 +2065,26 @@
               <w:left w:val="none"/>
               <w:right w:val="none"/>
             </w:tcBorders>
+            <w:shd w:fill="FFFFFF" w:val="clear"/>
           </w:tcPr>
           <w:p>
             <w:pPr>
-              <w:spacing w:after="40" w:line="240" w:lineRule="auto"/>
+              <w:spacing w:before="0" w:after="0" w:line="276" w:lineRule="auto"/>
               <w:jc w:val="left"/>
             </w:pPr>
             <w:r>
               <w:rPr>
-                <w:rFonts w:ascii="Times New Roman" w:hAnsi="Times New Roman"/>
-                <w:b/>
+                <w:rFonts w:ascii="Cambria" w:hAnsi="Cambria"/>
                 <w:color w:val="000000"/>
                 <w:sz w:val="19"/>
               </w:rPr>
-              <w:t>Wall_Material</w:t>
+              <w:t>Wall material</w:t>
             </w:r>
           </w:p>
         </w:tc>
         <w:tc>
           <w:tcPr>
-            <w:tcW w:type="dxa" w:w="1728"/>
+            <w:tcW w:type="dxa" w:w="2015"/>
             <w:tcMar>
               <w:top w:w="80" w:type="dxa"/>
               <w:bottom w:w="80" w:type="dxa"/>
@@ -1987,15 +2097,16 @@
               <w:left w:val="none"/>
               <w:right w:val="none"/>
             </w:tcBorders>
+            <w:shd w:fill="FFFFFF" w:val="clear"/>
           </w:tcPr>
           <w:p>
             <w:pPr>
-              <w:spacing w:after="40" w:line="240" w:lineRule="auto"/>
-              <w:jc w:val="left"/>
+              <w:spacing w:after="0" w:line="276" w:lineRule="auto" w:before="0"/>
+              <w:jc w:val="center"/>
             </w:pPr>
             <w:r>
               <w:rPr>
-                <w:rFonts w:ascii="Times New Roman" w:hAnsi="Times New Roman"/>
+                <w:rFonts w:ascii="Cambria" w:hAnsi="Cambria"/>
                 <w:color w:val="000000"/>
                 <w:sz w:val="19"/>
               </w:rPr>
@@ -2005,7 +2116,7 @@
         </w:tc>
         <w:tc>
           <w:tcPr>
-            <w:tcW w:type="dxa" w:w="1152"/>
+            <w:tcW w:type="dxa" w:w="2015"/>
             <w:tcMar>
               <w:top w:w="80" w:type="dxa"/>
               <w:bottom w:w="80" w:type="dxa"/>
@@ -2018,15 +2129,16 @@
               <w:left w:val="none"/>
               <w:right w:val="none"/>
             </w:tcBorders>
+            <w:shd w:fill="FFFFFF" w:val="clear"/>
           </w:tcPr>
           <w:p>
             <w:pPr>
-              <w:spacing w:after="40" w:line="240" w:lineRule="auto"/>
+              <w:spacing w:after="0" w:line="276" w:lineRule="auto" w:before="0"/>
               <w:jc w:val="center"/>
             </w:pPr>
             <w:r>
               <w:rPr>
-                <w:rFonts w:ascii="Times New Roman" w:hAnsi="Times New Roman"/>
+                <w:rFonts w:ascii="Cambria" w:hAnsi="Cambria"/>
                 <w:color w:val="000000"/>
                 <w:sz w:val="19"/>
               </w:rPr>
@@ -2049,15 +2161,16 @@
               <w:left w:val="none"/>
               <w:right w:val="none"/>
             </w:tcBorders>
+            <w:shd w:fill="FFFFFF" w:val="clear"/>
           </w:tcPr>
           <w:p>
             <w:pPr>
-              <w:spacing w:after="40" w:line="240" w:lineRule="auto"/>
+              <w:spacing w:after="0" w:line="276" w:lineRule="auto" w:before="0"/>
               <w:jc w:val="center"/>
             </w:pPr>
             <w:r>
               <w:rPr>
-                <w:rFonts w:ascii="Times New Roman" w:hAnsi="Times New Roman"/>
+                <w:rFonts w:ascii="Cambria" w:hAnsi="Cambria"/>
                 <w:color w:val="000000"/>
                 <w:sz w:val="19"/>
               </w:rPr>
@@ -2067,9 +2180,12 @@
         </w:tc>
       </w:tr>
       <w:tr>
+        <w:trPr>
+          <w:cantSplit/>
+        </w:trPr>
         <w:tc>
           <w:tcPr>
-            <w:tcW w:type="dxa" w:w="4320"/>
+            <w:tcW w:type="dxa" w:w="3600"/>
             <w:tcMar>
               <w:top w:w="80" w:type="dxa"/>
               <w:bottom w:w="80" w:type="dxa"/>
@@ -2082,26 +2198,26 @@
               <w:left w:val="none"/>
               <w:right w:val="none"/>
             </w:tcBorders>
+            <w:shd w:fill="FFFFFF" w:val="clear"/>
           </w:tcPr>
           <w:p>
             <w:pPr>
-              <w:spacing w:after="40" w:line="240" w:lineRule="auto"/>
+              <w:spacing w:before="0" w:after="0" w:line="276" w:lineRule="auto"/>
               <w:jc w:val="left"/>
             </w:pPr>
             <w:r>
               <w:rPr>
-                <w:rFonts w:ascii="Times New Roman" w:hAnsi="Times New Roman"/>
-                <w:b/>
+                <w:rFonts w:ascii="Cambria" w:hAnsi="Cambria"/>
                 <w:color w:val="000000"/>
                 <w:sz w:val="19"/>
               </w:rPr>
-              <w:t>Region</w:t>
+              <w:t>Region/Division</w:t>
             </w:r>
           </w:p>
         </w:tc>
         <w:tc>
           <w:tcPr>
-            <w:tcW w:type="dxa" w:w="1728"/>
+            <w:tcW w:type="dxa" w:w="2015"/>
             <w:tcMar>
               <w:top w:w="80" w:type="dxa"/>
               <w:bottom w:w="80" w:type="dxa"/>
@@ -2114,15 +2230,16 @@
               <w:left w:val="none"/>
               <w:right w:val="none"/>
             </w:tcBorders>
+            <w:shd w:fill="FFFFFF" w:val="clear"/>
           </w:tcPr>
           <w:p>
             <w:pPr>
-              <w:spacing w:after="40" w:line="240" w:lineRule="auto"/>
-              <w:jc w:val="left"/>
+              <w:spacing w:after="0" w:line="276" w:lineRule="auto" w:before="0"/>
+              <w:jc w:val="center"/>
             </w:pPr>
             <w:r>
               <w:rPr>
-                <w:rFonts w:ascii="Times New Roman" w:hAnsi="Times New Roman"/>
+                <w:rFonts w:ascii="Cambria" w:hAnsi="Cambria"/>
                 <w:color w:val="000000"/>
                 <w:sz w:val="19"/>
               </w:rPr>
@@ -2132,7 +2249,7 @@
         </w:tc>
         <w:tc>
           <w:tcPr>
-            <w:tcW w:type="dxa" w:w="1152"/>
+            <w:tcW w:type="dxa" w:w="2015"/>
             <w:tcMar>
               <w:top w:w="80" w:type="dxa"/>
               <w:bottom w:w="80" w:type="dxa"/>
@@ -2145,15 +2262,16 @@
               <w:left w:val="none"/>
               <w:right w:val="none"/>
             </w:tcBorders>
+            <w:shd w:fill="FFFFFF" w:val="clear"/>
           </w:tcPr>
           <w:p>
             <w:pPr>
-              <w:spacing w:after="40" w:line="240" w:lineRule="auto"/>
+              <w:spacing w:after="0" w:line="276" w:lineRule="auto" w:before="0"/>
               <w:jc w:val="center"/>
             </w:pPr>
             <w:r>
               <w:rPr>
-                <w:rFonts w:ascii="Times New Roman" w:hAnsi="Times New Roman"/>
+                <w:rFonts w:ascii="Cambria" w:hAnsi="Cambria"/>
                 <w:color w:val="000000"/>
                 <w:sz w:val="19"/>
               </w:rPr>
@@ -2176,15 +2294,16 @@
               <w:left w:val="none"/>
               <w:right w:val="none"/>
             </w:tcBorders>
+            <w:shd w:fill="FFFFFF" w:val="clear"/>
           </w:tcPr>
           <w:p>
             <w:pPr>
-              <w:spacing w:after="40" w:line="240" w:lineRule="auto"/>
+              <w:spacing w:after="0" w:line="276" w:lineRule="auto" w:before="0"/>
               <w:jc w:val="center"/>
             </w:pPr>
             <w:r>
               <w:rPr>
-                <w:rFonts w:ascii="Times New Roman" w:hAnsi="Times New Roman"/>
+                <w:rFonts w:ascii="Cambria" w:hAnsi="Cambria"/>
                 <w:color w:val="000000"/>
                 <w:sz w:val="19"/>
               </w:rPr>
@@ -2194,9 +2313,12 @@
         </w:tc>
       </w:tr>
       <w:tr>
+        <w:trPr>
+          <w:cantSplit/>
+        </w:trPr>
         <w:tc>
           <w:tcPr>
-            <w:tcW w:type="dxa" w:w="4320"/>
+            <w:tcW w:type="dxa" w:w="3600"/>
             <w:tcMar>
               <w:top w:w="80" w:type="dxa"/>
               <w:bottom w:w="80" w:type="dxa"/>
@@ -2209,26 +2331,26 @@
               <w:left w:val="none"/>
               <w:right w:val="none"/>
             </w:tcBorders>
+            <w:shd w:fill="FFFFFF" w:val="clear"/>
           </w:tcPr>
           <w:p>
             <w:pPr>
-              <w:spacing w:after="40" w:line="240" w:lineRule="auto"/>
+              <w:spacing w:before="0" w:after="0" w:line="276" w:lineRule="auto"/>
               <w:jc w:val="left"/>
             </w:pPr>
             <w:r>
               <w:rPr>
-                <w:rFonts w:ascii="Times New Roman" w:hAnsi="Times New Roman"/>
-                <w:b/>
+                <w:rFonts w:ascii="Cambria" w:hAnsi="Cambria"/>
                 <w:color w:val="000000"/>
                 <w:sz w:val="19"/>
               </w:rPr>
-              <w:t>Residence</w:t>
+              <w:t>Type of residence</w:t>
             </w:r>
           </w:p>
         </w:tc>
         <w:tc>
           <w:tcPr>
-            <w:tcW w:type="dxa" w:w="1728"/>
+            <w:tcW w:type="dxa" w:w="2015"/>
             <w:tcMar>
               <w:top w:w="80" w:type="dxa"/>
               <w:bottom w:w="80" w:type="dxa"/>
@@ -2241,15 +2363,16 @@
               <w:left w:val="none"/>
               <w:right w:val="none"/>
             </w:tcBorders>
+            <w:shd w:fill="FFFFFF" w:val="clear"/>
           </w:tcPr>
           <w:p>
             <w:pPr>
-              <w:spacing w:after="40" w:line="240" w:lineRule="auto"/>
-              <w:jc w:val="left"/>
+              <w:spacing w:after="0" w:line="276" w:lineRule="auto" w:before="0"/>
+              <w:jc w:val="center"/>
             </w:pPr>
             <w:r>
               <w:rPr>
-                <w:rFonts w:ascii="Times New Roman" w:hAnsi="Times New Roman"/>
+                <w:rFonts w:ascii="Cambria" w:hAnsi="Cambria"/>
                 <w:color w:val="000000"/>
                 <w:sz w:val="19"/>
               </w:rPr>
@@ -2259,7 +2382,7 @@
         </w:tc>
         <w:tc>
           <w:tcPr>
-            <w:tcW w:type="dxa" w:w="1152"/>
+            <w:tcW w:type="dxa" w:w="2015"/>
             <w:tcMar>
               <w:top w:w="80" w:type="dxa"/>
               <w:bottom w:w="80" w:type="dxa"/>
@@ -2272,15 +2395,16 @@
               <w:left w:val="none"/>
               <w:right w:val="none"/>
             </w:tcBorders>
+            <w:shd w:fill="FFFFFF" w:val="clear"/>
           </w:tcPr>
           <w:p>
             <w:pPr>
-              <w:spacing w:after="40" w:line="240" w:lineRule="auto"/>
+              <w:spacing w:after="0" w:line="276" w:lineRule="auto" w:before="0"/>
               <w:jc w:val="center"/>
             </w:pPr>
             <w:r>
               <w:rPr>
-                <w:rFonts w:ascii="Times New Roman" w:hAnsi="Times New Roman"/>
+                <w:rFonts w:ascii="Cambria" w:hAnsi="Cambria"/>
                 <w:color w:val="000000"/>
                 <w:sz w:val="19"/>
               </w:rPr>
@@ -2303,15 +2427,16 @@
               <w:left w:val="none"/>
               <w:right w:val="none"/>
             </w:tcBorders>
+            <w:shd w:fill="FFFFFF" w:val="clear"/>
           </w:tcPr>
           <w:p>
             <w:pPr>
-              <w:spacing w:after="40" w:line="240" w:lineRule="auto"/>
+              <w:spacing w:after="0" w:line="276" w:lineRule="auto" w:before="0"/>
               <w:jc w:val="center"/>
             </w:pPr>
             <w:r>
               <w:rPr>
-                <w:rFonts w:ascii="Times New Roman" w:hAnsi="Times New Roman"/>
+                <w:rFonts w:ascii="Cambria" w:hAnsi="Cambria"/>
                 <w:color w:val="000000"/>
                 <w:sz w:val="19"/>
               </w:rPr>
@@ -2344,7 +2469,7 @@
     </w:p>
     <w:sectPr>
       <w:pgSz w:w="12240" w:h="15840"/>
-      <w:pgMar w:top="1440" w:right="1440" w:bottom="1440" w:left="1440" w:header="720" w:footer="720" w:gutter="0"/>
+      <w:pgMar w:top="1152" w:right="1152" w:bottom="1152" w:left="1152" w:header="720" w:footer="720" w:gutter="0"/>
       <w:cols w:space="720"/>
       <w:docGrid w:linePitch="360"/>
     </w:sectPr>

</xml_diff>